<commit_message>
Added user stories to SRD
</commit_message>
<xml_diff>
--- a/SRD - SideQuest.docx
+++ b/SRD - SideQuest.docx
@@ -499,6 +499,65 @@
                 <w:caps/>
               </w:rPr>
             </w:pPr>
+            <w:r>
+              <w:rPr>
+                <w:caps/>
+              </w:rPr>
+              <w:t>9/21/26</w:t>
+            </w:r>
+          </w:p>
+        </w:tc>
+        <w:tc>
+          <w:tcPr>
+            <w:tcW w:w="2874" w:type="dxa"/>
+          </w:tcPr>
+          <w:p>
+            <w:pPr>
+              <w:spacing w:line="360" w:lineRule="auto"/>
+              <w:rPr>
+                <w:caps/>
+              </w:rPr>
+            </w:pPr>
+            <w:r>
+              <w:rPr>
+                <w:caps/>
+              </w:rPr>
+              <w:t>Justin Ngov</w:t>
+            </w:r>
+          </w:p>
+        </w:tc>
+        <w:tc>
+          <w:tcPr>
+            <w:tcW w:w="3103" w:type="dxa"/>
+          </w:tcPr>
+          <w:p>
+            <w:pPr>
+              <w:spacing w:line="360" w:lineRule="auto"/>
+              <w:rPr>
+                <w:caps/>
+              </w:rPr>
+            </w:pPr>
+            <w:r>
+              <w:rPr>
+                <w:caps/>
+              </w:rPr>
+              <w:t>Added user stories</w:t>
+            </w:r>
+          </w:p>
+        </w:tc>
+      </w:tr>
+      <w:tr>
+        <w:tc>
+          <w:tcPr>
+            <w:tcW w:w="3373" w:type="dxa"/>
+          </w:tcPr>
+          <w:p>
+            <w:pPr>
+              <w:spacing w:line="360" w:lineRule="auto"/>
+              <w:rPr>
+                <w:caps/>
+              </w:rPr>
+            </w:pPr>
           </w:p>
         </w:tc>
         <w:tc>
@@ -610,47 +669,6 @@
           </w:p>
         </w:tc>
       </w:tr>
-      <w:tr>
-        <w:tc>
-          <w:tcPr>
-            <w:tcW w:w="3373" w:type="dxa"/>
-          </w:tcPr>
-          <w:p>
-            <w:pPr>
-              <w:spacing w:line="360" w:lineRule="auto"/>
-              <w:rPr>
-                <w:caps/>
-              </w:rPr>
-            </w:pPr>
-          </w:p>
-        </w:tc>
-        <w:tc>
-          <w:tcPr>
-            <w:tcW w:w="2874" w:type="dxa"/>
-          </w:tcPr>
-          <w:p>
-            <w:pPr>
-              <w:spacing w:line="360" w:lineRule="auto"/>
-              <w:rPr>
-                <w:caps/>
-              </w:rPr>
-            </w:pPr>
-          </w:p>
-        </w:tc>
-        <w:tc>
-          <w:tcPr>
-            <w:tcW w:w="3103" w:type="dxa"/>
-          </w:tcPr>
-          <w:p>
-            <w:pPr>
-              <w:spacing w:line="360" w:lineRule="auto"/>
-              <w:rPr>
-                <w:caps/>
-              </w:rPr>
-            </w:pPr>
-          </w:p>
-        </w:tc>
-      </w:tr>
     </w:tbl>
     <w:p>
       <w:pPr>
@@ -668,13 +686,8 @@
         </w:rPr>
       </w:pPr>
       <w:r>
-        <w:rPr>
-          <w:noProof/>
-        </w:rPr>
-      </w:r>
-      <w:r>
-        <w:pict w14:anchorId="4C5EC7F2">
-          <v:rect id="Horizontal Line 1" o:spid="_x0000_s1028" style="width:468pt;height:1.1pt;visibility:visible;mso-wrap-style:square;mso-left-percent:-10001;mso-top-percent:-10001;mso-position-horizontal:absolute;mso-position-horizontal-relative:char;mso-position-vertical:absolute;mso-position-vertical-relative:line;mso-left-percent:-10001;mso-top-percent:-10001;v-text-anchor:top" o:gfxdata="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" filled="f">
+        <w:pict w14:anchorId="7EC5D341">
+          <v:rect id="Horizontal Line 1" o:spid="_x0000_s1028" alt="" style="width:468pt;height:1.1pt;visibility:visible;mso-wrap-style:square;mso-width-percent:0;mso-height-percent:0;mso-left-percent:-10001;mso-top-percent:-10001;mso-position-horizontal:absolute;mso-position-horizontal-relative:char;mso-position-vertical:absolute;mso-position-vertical-relative:line;mso-width-percent:0;mso-height-percent:0;mso-left-percent:-10001;mso-top-percent:-10001;v-text-anchor:top" filled="f">
             <o:lock v:ext="edit" rotation="t" aspectratio="t" verticies="t" text="t" shapetype="t"/>
             <w10:anchorlock/>
           </v:rect>
@@ -711,7 +724,7 @@
           <w:bCs/>
           <w:caps/>
         </w:rPr>
-        <w:t>[Project Title]</w:t>
+        <w:t>SideQuest</w:t>
       </w:r>
     </w:p>
     <w:p>
@@ -747,7 +760,15 @@
           <w:bCs/>
           <w:caps/>
         </w:rPr>
-        <w:t>Course: [Course Name/Number]</w:t>
+        <w:t xml:space="preserve">Course: </w:t>
+      </w:r>
+      <w:r>
+        <w:rPr>
+          <w:b/>
+          <w:bCs/>
+          <w:caps/>
+        </w:rPr>
+        <w:t>CSC 3100</w:t>
       </w:r>
     </w:p>
     <w:p>
@@ -778,13 +799,8 @@
         </w:rPr>
       </w:pPr>
       <w:r>
-        <w:rPr>
-          <w:noProof/>
-        </w:rPr>
-      </w:r>
-      <w:r>
-        <w:pict w14:anchorId="3AE1478B">
-          <v:rect id="Horizontal Line 2" o:spid="_x0000_s1027" style="width:468pt;height:1.1pt;visibility:visible;mso-wrap-style:square;mso-left-percent:-10001;mso-top-percent:-10001;mso-position-horizontal:absolute;mso-position-horizontal-relative:char;mso-position-vertical:absolute;mso-position-vertical-relative:line;mso-left-percent:-10001;mso-top-percent:-10001;v-text-anchor:top" o:gfxdata="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" filled="f">
+        <w:pict w14:anchorId="67CC441B">
+          <v:rect id="Horizontal Line 2" o:spid="_x0000_s1027" alt="" style="width:468pt;height:1.1pt;visibility:visible;mso-wrap-style:square;mso-width-percent:0;mso-height-percent:0;mso-left-percent:-10001;mso-top-percent:-10001;mso-position-horizontal:absolute;mso-position-horizontal-relative:char;mso-position-vertical:absolute;mso-position-vertical-relative:line;mso-width-percent:0;mso-height-percent:0;mso-left-percent:-10001;mso-top-percent:-10001;v-text-anchor:top" filled="f">
             <o:lock v:ext="edit" rotation="t" aspectratio="t" verticies="t" text="t" shapetype="t"/>
             <w10:anchorlock/>
           </v:rect>
@@ -1515,13 +1531,8 @@
         </w:rPr>
       </w:pPr>
       <w:r>
-        <w:rPr>
-          <w:noProof/>
-        </w:rPr>
-      </w:r>
-      <w:r>
-        <w:pict w14:anchorId="3D91B065">
-          <v:rect id="Horizontal Line 3" o:spid="_x0000_s1026" style="width:468pt;height:1.1pt;visibility:visible;mso-wrap-style:square;mso-left-percent:-10001;mso-top-percent:-10001;mso-position-horizontal:absolute;mso-position-horizontal-relative:char;mso-position-vertical:absolute;mso-position-vertical-relative:line;mso-left-percent:-10001;mso-top-percent:-10001;v-text-anchor:top" o:gfxdata="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" filled="f">
+        <w:pict w14:anchorId="4F2C2B6A">
+          <v:rect id="Horizontal Line 3" o:spid="_x0000_s1026" alt="" style="width:468pt;height:1.1pt;visibility:visible;mso-wrap-style:square;mso-width-percent:0;mso-height-percent:0;mso-left-percent:-10001;mso-top-percent:-10001;mso-position-horizontal:absolute;mso-position-horizontal-relative:char;mso-position-vertical:absolute;mso-position-vertical-relative:line;mso-width-percent:0;mso-height-percent:0;mso-left-percent:-10001;mso-top-percent:-10001;v-text-anchor:top" filled="f">
             <o:lock v:ext="edit" rotation="t" aspectratio="t" verticies="t" text="t" shapetype="t"/>
             <w10:anchorlock/>
           </v:rect>
@@ -1973,6 +1984,12 @@
               </w:rPr>
               <w:t>01</w:t>
             </w:r>
+            <w:r>
+              <w:rPr>
+                <w:caps/>
+              </w:rPr>
+              <w:t xml:space="preserve"> Justn Ngov</w:t>
+            </w:r>
           </w:p>
         </w:tc>
         <w:tc>
@@ -1985,16 +2002,10 @@
               <w:ind w:left="360"/>
             </w:pPr>
             <w:r>
-              <w:t>As a</w:t>
-            </w:r>
-            <w:r>
-              <w:t xml:space="preserve"> user, I want to authenticate </w:t>
-            </w:r>
-            <w:r>
-              <w:t>via</w:t>
-            </w:r>
-            <w:r>
-              <w:t xml:space="preserve"> username and password.</w:t>
+              <w:t>As a new user, I want to select my current interests and skill levels during account creation so that the app can immediately recommend</w:t>
+            </w:r>
+            <w:r>
+              <w:t xml:space="preserve"> activities to me.</w:t>
             </w:r>
           </w:p>
         </w:tc>
@@ -2008,7 +2019,7 @@
               <w:ind w:left="360"/>
             </w:pPr>
             <w:r>
-              <w:t>2</w:t>
+              <w:t>1</w:t>
             </w:r>
           </w:p>
         </w:tc>
@@ -2038,6 +2049,12 @@
               </w:rPr>
               <w:t>02</w:t>
             </w:r>
+            <w:r>
+              <w:rPr>
+                <w:caps/>
+              </w:rPr>
+              <w:t xml:space="preserve"> Justin Ngov</w:t>
+            </w:r>
           </w:p>
         </w:tc>
         <w:tc>
@@ -2050,10 +2067,22 @@
               <w:ind w:left="360"/>
             </w:pPr>
             <w:r>
-              <w:t xml:space="preserve">As a user, I want to </w:t>
-            </w:r>
-            <w:r>
-              <w:t>store workout information</w:t>
+              <w:t xml:space="preserve">As a hobbyist, I </w:t>
+            </w:r>
+            <w:r>
+              <w:t>want to search for groups using specific interest tags</w:t>
+            </w:r>
+            <w:r>
+              <w:t xml:space="preserve">, </w:t>
+            </w:r>
+            <w:r>
+              <w:t>so that I can find and join</w:t>
+            </w:r>
+            <w:r>
+              <w:t xml:space="preserve"> a </w:t>
+            </w:r>
+            <w:r>
+              <w:t>community that shares my exact passion.</w:t>
             </w:r>
           </w:p>
         </w:tc>
@@ -2067,7 +2096,7 @@
               <w:ind w:left="360"/>
             </w:pPr>
             <w:r>
-              <w:t>1</w:t>
+              <w:t>3</w:t>
             </w:r>
           </w:p>
         </w:tc>
@@ -2097,6 +2126,12 @@
               </w:rPr>
               <w:t>03</w:t>
             </w:r>
+            <w:r>
+              <w:rPr>
+                <w:caps/>
+              </w:rPr>
+              <w:t xml:space="preserve"> Justin Ngov</w:t>
+            </w:r>
           </w:p>
         </w:tc>
         <w:tc>
@@ -2109,10 +2144,11 @@
               <w:ind w:left="360"/>
             </w:pPr>
             <w:r>
-              <w:t>As a user, I want to</w:t>
-            </w:r>
-            <w:r>
-              <w:t xml:space="preserve"> search workout history</w:t>
+              <w:t xml:space="preserve">As an experienced creator, I want to upload photos, descriptions, and progress updates for an </w:t>
+            </w:r>
+            <w:r>
+              <w:lastRenderedPageBreak/>
+              <w:t>ongoing project so that I can share my journey and receive constructive feedback from peers.</w:t>
             </w:r>
           </w:p>
         </w:tc>
@@ -2126,7 +2162,8 @@
               <w:ind w:left="360"/>
             </w:pPr>
             <w:r>
-              <w:t>3</w:t>
+              <w:lastRenderedPageBreak/>
+              <w:t>5</w:t>
             </w:r>
           </w:p>
         </w:tc>
@@ -2156,6 +2193,12 @@
               </w:rPr>
               <w:t>04</w:t>
             </w:r>
+            <w:r>
+              <w:rPr>
+                <w:caps/>
+              </w:rPr>
+              <w:t xml:space="preserve"> Luis Mendoza</w:t>
+            </w:r>
           </w:p>
         </w:tc>
         <w:tc>
@@ -2168,10 +2211,329 @@
               <w:ind w:left="360"/>
             </w:pPr>
             <w:r>
-              <w:t xml:space="preserve">As a user, I want to </w:t>
-            </w:r>
-            <w:r>
-              <w:t>add new workout types.</w:t>
+              <w:t>As a curious beginner, I want to filter community posts and projects by a "beginner-friendly" tag so that I can find approachable content and avoid feeling overwhelmed while learning a new hobby.</w:t>
+            </w:r>
+          </w:p>
+        </w:tc>
+        <w:tc>
+          <w:tcPr>
+            <w:tcW w:w="2866" w:type="dxa"/>
+          </w:tcPr>
+          <w:p>
+            <w:pPr>
+              <w:spacing w:line="360" w:lineRule="auto"/>
+              <w:ind w:left="360"/>
+            </w:pPr>
+            <w:r>
+              <w:t>7</w:t>
+            </w:r>
+          </w:p>
+        </w:tc>
+      </w:tr>
+      <w:tr>
+        <w:tc>
+          <w:tcPr>
+            <w:tcW w:w="2898" w:type="dxa"/>
+          </w:tcPr>
+          <w:p>
+            <w:pPr>
+              <w:spacing w:line="360" w:lineRule="auto"/>
+              <w:rPr>
+                <w:caps/>
+              </w:rPr>
+            </w:pPr>
+            <w:r>
+              <w:rPr>
+                <w:caps/>
+              </w:rPr>
+              <w:t>US-0</w:t>
+            </w:r>
+            <w:r>
+              <w:rPr>
+                <w:caps/>
+              </w:rPr>
+              <w:t>5 Luis Mendoza</w:t>
+            </w:r>
+          </w:p>
+        </w:tc>
+        <w:tc>
+          <w:tcPr>
+            <w:tcW w:w="2866" w:type="dxa"/>
+          </w:tcPr>
+          <w:p>
+            <w:pPr>
+              <w:spacing w:line="360" w:lineRule="auto"/>
+              <w:ind w:left="360"/>
+            </w:pPr>
+            <w:r>
+              <w:t>As a community member, I want to send direct messages to other users so that I can ask specific questions about their techniques or collaborate privately</w:t>
+            </w:r>
+          </w:p>
+        </w:tc>
+        <w:tc>
+          <w:tcPr>
+            <w:tcW w:w="2866" w:type="dxa"/>
+          </w:tcPr>
+          <w:p>
+            <w:pPr>
+              <w:spacing w:line="360" w:lineRule="auto"/>
+              <w:ind w:left="360"/>
+            </w:pPr>
+            <w:r>
+              <w:t>6</w:t>
+            </w:r>
+          </w:p>
+        </w:tc>
+      </w:tr>
+      <w:tr>
+        <w:tc>
+          <w:tcPr>
+            <w:tcW w:w="2898" w:type="dxa"/>
+          </w:tcPr>
+          <w:p>
+            <w:pPr>
+              <w:spacing w:line="360" w:lineRule="auto"/>
+              <w:rPr>
+                <w:caps/>
+              </w:rPr>
+            </w:pPr>
+            <w:r>
+              <w:rPr>
+                <w:caps/>
+              </w:rPr>
+              <w:t>US-0</w:t>
+            </w:r>
+            <w:r>
+              <w:rPr>
+                <w:caps/>
+              </w:rPr>
+              <w:t>6 Luis Mendoza</w:t>
+            </w:r>
+          </w:p>
+        </w:tc>
+        <w:tc>
+          <w:tcPr>
+            <w:tcW w:w="2866" w:type="dxa"/>
+          </w:tcPr>
+          <w:p>
+            <w:pPr>
+              <w:spacing w:line="360" w:lineRule="auto"/>
+              <w:ind w:left="360"/>
+            </w:pPr>
+            <w:r>
+              <w:t>As a community organizer, I want to create a dedicated group space with</w:t>
+            </w:r>
+            <w:r>
+              <w:t xml:space="preserve"> </w:t>
+            </w:r>
+            <w:r>
+              <w:t xml:space="preserve">rules and </w:t>
+            </w:r>
+            <w:r>
+              <w:t>moderat</w:t>
+            </w:r>
+            <w:r>
+              <w:t xml:space="preserve">ion </w:t>
+            </w:r>
+            <w:r>
+              <w:t>so that I can cultivate a safe, focused environment for a specific hobby.</w:t>
+            </w:r>
+          </w:p>
+        </w:tc>
+        <w:tc>
+          <w:tcPr>
+            <w:tcW w:w="2866" w:type="dxa"/>
+          </w:tcPr>
+          <w:p>
+            <w:pPr>
+              <w:spacing w:line="360" w:lineRule="auto"/>
+              <w:ind w:left="360"/>
+            </w:pPr>
+            <w:r>
+              <w:t>2</w:t>
+            </w:r>
+          </w:p>
+        </w:tc>
+      </w:tr>
+      <w:tr>
+        <w:tc>
+          <w:tcPr>
+            <w:tcW w:w="2898" w:type="dxa"/>
+          </w:tcPr>
+          <w:p>
+            <w:pPr>
+              <w:spacing w:line="360" w:lineRule="auto"/>
+              <w:rPr>
+                <w:caps/>
+              </w:rPr>
+            </w:pPr>
+            <w:r>
+              <w:rPr>
+                <w:caps/>
+              </w:rPr>
+              <w:t>US-0</w:t>
+            </w:r>
+            <w:r>
+              <w:rPr>
+                <w:caps/>
+              </w:rPr>
+              <w:t xml:space="preserve">7 </w:t>
+            </w:r>
+            <w:r>
+              <w:rPr>
+                <w:caps/>
+              </w:rPr>
+              <w:t>Ally Stauffer</w:t>
+            </w:r>
+          </w:p>
+        </w:tc>
+        <w:tc>
+          <w:tcPr>
+            <w:tcW w:w="2866" w:type="dxa"/>
+          </w:tcPr>
+          <w:p>
+            <w:pPr>
+              <w:spacing w:line="360" w:lineRule="auto"/>
+              <w:ind w:left="360"/>
+            </w:pPr>
+            <w:r>
+              <w:t xml:space="preserve">As a hobbyist, I want </w:t>
+            </w:r>
+            <w:r>
+              <w:lastRenderedPageBreak/>
+              <w:t>to flag my project with a "Looking for Help/Collaborators" status so that I can find other users with complementary skills to help me complete my work.</w:t>
+            </w:r>
+          </w:p>
+        </w:tc>
+        <w:tc>
+          <w:tcPr>
+            <w:tcW w:w="2866" w:type="dxa"/>
+          </w:tcPr>
+          <w:p>
+            <w:pPr>
+              <w:spacing w:line="360" w:lineRule="auto"/>
+              <w:ind w:left="360"/>
+            </w:pPr>
+            <w:r>
+              <w:lastRenderedPageBreak/>
+              <w:t>8</w:t>
+            </w:r>
+          </w:p>
+        </w:tc>
+      </w:tr>
+      <w:tr>
+        <w:tc>
+          <w:tcPr>
+            <w:tcW w:w="2898" w:type="dxa"/>
+          </w:tcPr>
+          <w:p>
+            <w:pPr>
+              <w:spacing w:line="360" w:lineRule="auto"/>
+              <w:rPr>
+                <w:caps/>
+              </w:rPr>
+            </w:pPr>
+            <w:r>
+              <w:rPr>
+                <w:caps/>
+              </w:rPr>
+              <w:t>US-0</w:t>
+            </w:r>
+            <w:r>
+              <w:rPr>
+                <w:caps/>
+              </w:rPr>
+              <w:t xml:space="preserve">8 </w:t>
+            </w:r>
+            <w:r>
+              <w:rPr>
+                <w:caps/>
+              </w:rPr>
+              <w:t>Ally Stauffer</w:t>
+            </w:r>
+          </w:p>
+        </w:tc>
+        <w:tc>
+          <w:tcPr>
+            <w:tcW w:w="2866" w:type="dxa"/>
+          </w:tcPr>
+          <w:p>
+            <w:pPr>
+              <w:spacing w:line="360" w:lineRule="auto"/>
+              <w:ind w:left="360"/>
+            </w:pPr>
+            <w:r>
+              <w:t>As a user, I want to view a shared calendar within my joined communities so that I can discover and RSVP to upcoming</w:t>
+            </w:r>
+            <w:r>
+              <w:t xml:space="preserve"> activities.</w:t>
+            </w:r>
+          </w:p>
+        </w:tc>
+        <w:tc>
+          <w:tcPr>
+            <w:tcW w:w="2866" w:type="dxa"/>
+          </w:tcPr>
+          <w:p>
+            <w:pPr>
+              <w:spacing w:line="360" w:lineRule="auto"/>
+              <w:ind w:left="360"/>
+            </w:pPr>
+            <w:r>
+              <w:t>9</w:t>
+            </w:r>
+          </w:p>
+        </w:tc>
+      </w:tr>
+      <w:tr>
+        <w:tc>
+          <w:tcPr>
+            <w:tcW w:w="2898" w:type="dxa"/>
+          </w:tcPr>
+          <w:p>
+            <w:pPr>
+              <w:spacing w:line="360" w:lineRule="auto"/>
+              <w:rPr>
+                <w:caps/>
+              </w:rPr>
+            </w:pPr>
+            <w:r>
+              <w:rPr>
+                <w:caps/>
+              </w:rPr>
+              <w:t>US-0</w:t>
+            </w:r>
+            <w:r>
+              <w:rPr>
+                <w:caps/>
+              </w:rPr>
+              <w:t xml:space="preserve">9 </w:t>
+            </w:r>
+            <w:r>
+              <w:rPr>
+                <w:caps/>
+              </w:rPr>
+              <w:t>Ally Stauffer</w:t>
+            </w:r>
+          </w:p>
+        </w:tc>
+        <w:tc>
+          <w:tcPr>
+            <w:tcW w:w="2866" w:type="dxa"/>
+          </w:tcPr>
+          <w:p>
+            <w:pPr>
+              <w:spacing w:line="360" w:lineRule="auto"/>
+              <w:ind w:left="360"/>
+            </w:pPr>
+            <w:r>
+              <w:t xml:space="preserve">As a returning user, I want to view an aggregated feed of the latest posts from the specific creators and groups I follow so that I can stay </w:t>
+            </w:r>
+            <w:r>
+              <w:t>up to date</w:t>
+            </w:r>
+            <w:r>
+              <w:t xml:space="preserve"> on my interests</w:t>
             </w:r>
           </w:p>
         </w:tc>
@@ -7113,29 +7475,31 @@
 </a:theme>
 </file>
 
+<file path=word/webextensions/taskpanes.xml><?xml version="1.0" encoding="utf-8"?>
+<wetp:taskpanes xmlns:wetp="http://schemas.microsoft.com/office/webextensions/taskpanes/2010/11">
+  <wetp:taskpane dockstate="right" visibility="0" width="350" row="0">
+    <wetp:webextensionref xmlns:r="http://schemas.openxmlformats.org/officeDocument/2006/relationships" r:id="rId1"/>
+  </wetp:taskpane>
+</wetp:taskpanes>
+</file>
+
+<file path=word/webextensions/webextension1.xml><?xml version="1.0" encoding="utf-8"?>
+<we:webextension xmlns:we="http://schemas.microsoft.com/office/webextensions/webextension/2010/11" id="{1DB7B09B-6C28-3546-AD93-E94156AF9207}">
+  <we:reference id="08173345-8098-4c78-8b6f-33127d2e059c" version="1.0.0.0" store="EXCatalog" storeType="EXCatalog"/>
+  <we:alternateReferences/>
+  <we:properties/>
+  <we:bindings/>
+  <we:snapshot xmlns:r="http://schemas.openxmlformats.org/officeDocument/2006/relationships"/>
+</we:webextension>
+</file>
+
 <file path=customXml/item1.xml><?xml version="1.0" encoding="utf-8"?>
-<p:properties xmlns:p="http://schemas.microsoft.com/office/2006/metadata/properties" xmlns:xsi="http://www.w3.org/2001/XMLSchema-instance" xmlns:pc="http://schemas.microsoft.com/office/infopath/2007/PartnerControls">
-  <documentManagement>
-    <Development_x0020_Phase xmlns="465633ec-d69e-42ae-b4b0-0dce57937a5a">Sustaining</Development_x0020_Phase>
-    <Document_x0020_Type xmlns="465633ec-d69e-42ae-b4b0-0dce57937a5a">Template</Document_x0020_Type>
-    <Document_x0020_Author xmlns="465633ec-d69e-42ae-b4b0-0dce57937a5a">
-      <UserInfo>
-        <DisplayName>Flottorp, Cheryl (JSC-SA)[WYLE LABORATORIES, INC.]</DisplayName>
-        <AccountId>76</AccountId>
-        <AccountType/>
-      </UserInfo>
-    </Document_x0020_Author>
-    <Increment xmlns="27242fef-9cfa-4fe3-8653-3bd28d129dca"/>
-    <Sensitivity xmlns="27242fef-9cfa-4fe3-8653-3bd28d129dca">Unrestricted</Sensitivity>
-    <Experiment xmlns="27242fef-9cfa-4fe3-8653-3bd28d129dca"/>
-    <Flight xmlns="27242fef-9cfa-4fe3-8653-3bd28d129dca">
-      <Value>None</Value>
-    </Flight>
-    <Hardware xmlns="27242fef-9cfa-4fe3-8653-3bd28d129dca">
-      <Value>None</Value>
-    </Hardware>
-  </documentManagement>
-</p:properties>
+<?mso-contentType ?>
+<FormTemplates xmlns="http://schemas.microsoft.com/sharepoint/v3/contenttype/forms">
+  <Display>DocumentLibraryForm</Display>
+  <Edit>DocumentLibraryForm</Edit>
+  <New>DocumentLibraryForm</New>
+</FormTemplates>
 </file>
 
 <file path=customXml/item2.xml><?xml version="1.0" encoding="utf-8"?>
@@ -7814,21 +8178,34 @@
 </file>
 
 <file path=customXml/item3.xml><?xml version="1.0" encoding="utf-8"?>
-<?mso-contentType ?>
-<FormTemplates xmlns="http://schemas.microsoft.com/sharepoint/v3/contenttype/forms">
-  <Display>DocumentLibraryForm</Display>
-  <Edit>DocumentLibraryForm</Edit>
-  <New>DocumentLibraryForm</New>
-</FormTemplates>
+<p:properties xmlns:p="http://schemas.microsoft.com/office/2006/metadata/properties" xmlns:xsi="http://www.w3.org/2001/XMLSchema-instance" xmlns:pc="http://schemas.microsoft.com/office/infopath/2007/PartnerControls">
+  <documentManagement>
+    <Development_x0020_Phase xmlns="465633ec-d69e-42ae-b4b0-0dce57937a5a">Sustaining</Development_x0020_Phase>
+    <Document_x0020_Type xmlns="465633ec-d69e-42ae-b4b0-0dce57937a5a">Template</Document_x0020_Type>
+    <Document_x0020_Author xmlns="465633ec-d69e-42ae-b4b0-0dce57937a5a">
+      <UserInfo>
+        <DisplayName>Flottorp, Cheryl (JSC-SA)[WYLE LABORATORIES, INC.]</DisplayName>
+        <AccountId>76</AccountId>
+        <AccountType/>
+      </UserInfo>
+    </Document_x0020_Author>
+    <Increment xmlns="27242fef-9cfa-4fe3-8653-3bd28d129dca"/>
+    <Sensitivity xmlns="27242fef-9cfa-4fe3-8653-3bd28d129dca">Unrestricted</Sensitivity>
+    <Experiment xmlns="27242fef-9cfa-4fe3-8653-3bd28d129dca"/>
+    <Flight xmlns="27242fef-9cfa-4fe3-8653-3bd28d129dca">
+      <Value>None</Value>
+    </Flight>
+    <Hardware xmlns="27242fef-9cfa-4fe3-8653-3bd28d129dca">
+      <Value>None</Value>
+    </Hardware>
+  </documentManagement>
+</p:properties>
 </file>
 
 <file path=customXml/itemProps1.xml><?xml version="1.0" encoding="utf-8"?>
-<ds:datastoreItem xmlns:ds="http://schemas.openxmlformats.org/officeDocument/2006/customXml" ds:itemID="{BBE85EB1-7069-4C57-AAD6-F91878A3B1CC}">
+<ds:datastoreItem xmlns:ds="http://schemas.openxmlformats.org/officeDocument/2006/customXml" ds:itemID="{030D5295-6A79-42C5-A0B7-1016DED61AA1}">
   <ds:schemaRefs>
-    <ds:schemaRef ds:uri="http://schemas.microsoft.com/office/2006/metadata/properties"/>
-    <ds:schemaRef ds:uri="http://schemas.microsoft.com/office/infopath/2007/PartnerControls"/>
-    <ds:schemaRef ds:uri="465633ec-d69e-42ae-b4b0-0dce57937a5a"/>
-    <ds:schemaRef ds:uri="27242fef-9cfa-4fe3-8653-3bd28d129dca"/>
+    <ds:schemaRef ds:uri="http://schemas.microsoft.com/sharepoint/v3/contenttype/forms"/>
   </ds:schemaRefs>
 </ds:datastoreItem>
 </file>
@@ -7853,9 +8230,12 @@
 </file>
 
 <file path=customXml/itemProps3.xml><?xml version="1.0" encoding="utf-8"?>
-<ds:datastoreItem xmlns:ds="http://schemas.openxmlformats.org/officeDocument/2006/customXml" ds:itemID="{030D5295-6A79-42C5-A0B7-1016DED61AA1}">
+<ds:datastoreItem xmlns:ds="http://schemas.openxmlformats.org/officeDocument/2006/customXml" ds:itemID="{BBE85EB1-7069-4C57-AAD6-F91878A3B1CC}">
   <ds:schemaRefs>
-    <ds:schemaRef ds:uri="http://schemas.microsoft.com/sharepoint/v3/contenttype/forms"/>
+    <ds:schemaRef ds:uri="http://schemas.microsoft.com/office/2006/metadata/properties"/>
+    <ds:schemaRef ds:uri="http://schemas.microsoft.com/office/infopath/2007/PartnerControls"/>
+    <ds:schemaRef ds:uri="465633ec-d69e-42ae-b4b0-0dce57937a5a"/>
+    <ds:schemaRef ds:uri="27242fef-9cfa-4fe3-8653-3bd28d129dca"/>
   </ds:schemaRefs>
 </ds:datastoreItem>
 </file>
</xml_diff>